<commit_message>
Fix final reports titles and add Git screenshots
</commit_message>
<xml_diff>
--- a/reports/LR1_1_Git_Diagrams_PRs_Syllabus_uno.docx
+++ b/reports/LR1_1_Git_Diagrams_PRs_Syllabus_uno.docx
@@ -24,12 +24,12 @@
       </w:pPr>
       <w:r>
         <w:rPr>
-          <w:rFonts w:ascii="Times New Roman" w:hAnsi="Times New Roman" w:eastAsia="Times New Roman"/>
+          <w:rFonts w:ascii="Times New Roman" w:hAnsi="Times New Roman"/>
           <w:b w:val="0"/>
           <w:i w:val="0"/>
           <w:sz w:val="28"/>
         </w:rPr>
-        <w:t>Івано-Франківський національний технічний університет нафти і газу</w:t>
+        <w:t>Карпатський національний університет імені Василя Стефаника</w:t>
       </w:r>
     </w:p>
     <w:p>
@@ -39,12 +39,12 @@
       </w:pPr>
       <w:r>
         <w:rPr>
-          <w:rFonts w:ascii="Times New Roman" w:hAnsi="Times New Roman" w:eastAsia="Times New Roman"/>
+          <w:rFonts w:ascii="Times New Roman" w:hAnsi="Times New Roman"/>
           <w:b w:val="0"/>
           <w:i w:val="0"/>
           <w:sz w:val="28"/>
         </w:rPr>
-        <w:t>Кафедра програмної інженерії</w:t>
+        <w:t>Факультет математики та інформатики</w:t>
       </w:r>
     </w:p>
     <w:p>
@@ -54,11 +54,12 @@
       </w:pPr>
       <w:r>
         <w:rPr>
-          <w:rFonts w:ascii="Times New Roman" w:hAnsi="Times New Roman" w:eastAsia="Times New Roman"/>
+          <w:rFonts w:ascii="Times New Roman" w:hAnsi="Times New Roman"/>
           <w:b w:val="0"/>
           <w:i w:val="0"/>
           <w:sz w:val="28"/>
         </w:rPr>
+        <w:t>Кафедра комп’ютерних наук та інформаційних систем</w:t>
       </w:r>
     </w:p>
     <w:p>
@@ -407,6 +408,10 @@
     </w:p>
     <w:p>
       <w:r>
+        <w:rPr>
+          <w:rFonts w:ascii="Times New Roman" w:hAnsi="Times New Roman"/>
+          <w:sz w:val="28"/>
+        </w:rPr>
         <w:br w:type="page"/>
       </w:r>
     </w:p>
@@ -1085,7 +1090,7 @@
       </w:pPr>
       <w:r>
         <w:rPr>
-          <w:rFonts w:ascii="Courier New" w:hAnsi="Courier New" w:eastAsia="Courier New"/>
+          <w:rFonts w:ascii="Times New Roman" w:hAnsi="Times New Roman" w:eastAsia="Courier New"/>
           <w:b w:val="0"/>
           <w:i w:val="0"/>
           <w:sz w:val="20"/>
@@ -1101,7 +1106,7 @@
       </w:pPr>
       <w:r>
         <w:rPr>
-          <w:rFonts w:ascii="Courier New" w:hAnsi="Courier New" w:eastAsia="Courier New"/>
+          <w:rFonts w:ascii="Times New Roman" w:hAnsi="Times New Roman" w:eastAsia="Courier New"/>
           <w:b w:val="0"/>
           <w:i w:val="0"/>
           <w:sz w:val="20"/>
@@ -1134,7 +1139,7 @@
       </w:pPr>
       <w:r>
         <w:rPr>
-          <w:rFonts w:ascii="Courier New" w:hAnsi="Courier New" w:eastAsia="Courier New"/>
+          <w:rFonts w:ascii="Times New Roman" w:hAnsi="Times New Roman" w:eastAsia="Courier New"/>
           <w:b w:val="0"/>
           <w:i w:val="0"/>
           <w:sz w:val="20"/>
@@ -1150,12 +1155,12 @@
       </w:pPr>
       <w:r>
         <w:rPr>
-          <w:rFonts w:ascii="Courier New" w:hAnsi="Courier New" w:eastAsia="Courier New"/>
+          <w:rFonts w:ascii="Times New Roman" w:hAnsi="Times New Roman" w:eastAsia="Courier New"/>
           <w:b w:val="0"/>
           <w:i w:val="0"/>
           <w:sz w:val="20"/>
         </w:rPr>
-        <w:t>mkdir -p diagrams/class</w:t>
+        <w:t>mkdir -p docs/uml</w:t>
       </w:r>
     </w:p>
     <w:p>
@@ -1166,12 +1171,12 @@
       </w:pPr>
       <w:r>
         <w:rPr>
-          <w:rFonts w:ascii="Courier New" w:hAnsi="Courier New" w:eastAsia="Courier New"/>
+          <w:rFonts w:ascii="Times New Roman" w:hAnsi="Times New Roman" w:eastAsia="Courier New"/>
           <w:b w:val="0"/>
           <w:i w:val="0"/>
           <w:sz w:val="20"/>
         </w:rPr>
-        <w:t># скопіювати або створити файл diagrams/class/class_diagram.puml</w:t>
+        <w:t># скопіювати або створити файл docs/uml/class_diagram_syllabus_uno.puml</w:t>
       </w:r>
     </w:p>
     <w:p>
@@ -1182,12 +1187,12 @@
       </w:pPr>
       <w:r>
         <w:rPr>
-          <w:rFonts w:ascii="Courier New" w:hAnsi="Courier New" w:eastAsia="Courier New"/>
+          <w:rFonts w:ascii="Times New Roman" w:hAnsi="Times New Roman" w:eastAsia="Courier New"/>
           <w:b w:val="0"/>
           <w:i w:val="0"/>
           <w:sz w:val="20"/>
         </w:rPr>
-        <w:t>cp class_diagram_syllabus_uno.puml diagrams/class/class_diagram.puml</w:t>
+        <w:t>cp class_diagram_syllabus_uno.puml docs/uml/class_diagram_syllabus_uno.puml</w:t>
       </w:r>
     </w:p>
     <w:p>
@@ -1198,7 +1203,7 @@
       </w:pPr>
       <w:r>
         <w:rPr>
-          <w:rFonts w:ascii="Courier New" w:hAnsi="Courier New" w:eastAsia="Courier New"/>
+          <w:rFonts w:ascii="Times New Roman" w:hAnsi="Times New Roman" w:eastAsia="Courier New"/>
           <w:b w:val="0"/>
           <w:i w:val="0"/>
           <w:sz w:val="20"/>
@@ -1214,12 +1219,12 @@
       </w:pPr>
       <w:r>
         <w:rPr>
-          <w:rFonts w:ascii="Courier New" w:hAnsi="Courier New" w:eastAsia="Courier New"/>
+          <w:rFonts w:ascii="Times New Roman" w:hAnsi="Times New Roman" w:eastAsia="Courier New"/>
           <w:b w:val="0"/>
           <w:i w:val="0"/>
           <w:sz w:val="20"/>
         </w:rPr>
-        <w:t>git add diagrams/class/class_diagram.puml</w:t>
+        <w:t>git add docs/uml/class_diagram_syllabus_uno.puml</w:t>
       </w:r>
     </w:p>
     <w:p>
@@ -1230,7 +1235,7 @@
       </w:pPr>
       <w:r>
         <w:rPr>
-          <w:rFonts w:ascii="Courier New" w:hAnsi="Courier New" w:eastAsia="Courier New"/>
+          <w:rFonts w:ascii="Times New Roman" w:hAnsi="Times New Roman" w:eastAsia="Courier New"/>
           <w:b w:val="0"/>
           <w:i w:val="0"/>
           <w:sz w:val="20"/>
@@ -1246,7 +1251,7 @@
       </w:pPr>
       <w:r>
         <w:rPr>
-          <w:rFonts w:ascii="Courier New" w:hAnsi="Courier New" w:eastAsia="Courier New"/>
+          <w:rFonts w:ascii="Times New Roman" w:hAnsi="Times New Roman" w:eastAsia="Courier New"/>
           <w:b w:val="0"/>
           <w:i w:val="0"/>
           <w:sz w:val="20"/>
@@ -1279,7 +1284,7 @@
       </w:pPr>
       <w:r>
         <w:rPr>
-          <w:rFonts w:ascii="Courier New" w:hAnsi="Courier New" w:eastAsia="Courier New"/>
+          <w:rFonts w:ascii="Times New Roman" w:hAnsi="Times New Roman" w:eastAsia="Courier New"/>
           <w:b w:val="0"/>
           <w:i w:val="0"/>
           <w:sz w:val="20"/>
@@ -1295,7 +1300,7 @@
       </w:pPr>
       <w:r>
         <w:rPr>
-          <w:rFonts w:ascii="Courier New" w:hAnsi="Courier New" w:eastAsia="Courier New"/>
+          <w:rFonts w:ascii="Times New Roman" w:hAnsi="Times New Roman" w:eastAsia="Courier New"/>
           <w:b w:val="0"/>
           <w:i w:val="0"/>
           <w:sz w:val="20"/>
@@ -1311,7 +1316,7 @@
       </w:pPr>
       <w:r>
         <w:rPr>
-          <w:rFonts w:ascii="Courier New" w:hAnsi="Courier New" w:eastAsia="Courier New"/>
+          <w:rFonts w:ascii="Times New Roman" w:hAnsi="Times New Roman" w:eastAsia="Courier New"/>
           <w:b w:val="0"/>
           <w:i w:val="0"/>
           <w:sz w:val="20"/>
@@ -1327,12 +1332,12 @@
       </w:pPr>
       <w:r>
         <w:rPr>
-          <w:rFonts w:ascii="Courier New" w:hAnsi="Courier New" w:eastAsia="Courier New"/>
+          <w:rFonts w:ascii="Times New Roman" w:hAnsi="Times New Roman" w:eastAsia="Courier New"/>
           <w:b w:val="0"/>
           <w:i w:val="0"/>
           <w:sz w:val="20"/>
         </w:rPr>
-        <w:t>mkdir -p diagrams/use-case</w:t>
+        <w:t>mkdir -p docs/diagrams</w:t>
       </w:r>
     </w:p>
     <w:p>
@@ -1343,12 +1348,12 @@
       </w:pPr>
       <w:r>
         <w:rPr>
-          <w:rFonts w:ascii="Courier New" w:hAnsi="Courier New" w:eastAsia="Courier New"/>
+          <w:rFonts w:ascii="Times New Roman" w:hAnsi="Times New Roman" w:eastAsia="Courier New"/>
           <w:b w:val="0"/>
           <w:i w:val="0"/>
           <w:sz w:val="20"/>
         </w:rPr>
-        <w:t># скопіювати експортовані зображення use case diagram у diagrams/use-case/</w:t>
+        <w:t># скопіювати експортовані зображення use case diagram у docs/diagrams/</w:t>
       </w:r>
     </w:p>
     <w:p>
@@ -1359,12 +1364,12 @@
       </w:pPr>
       <w:r>
         <w:rPr>
-          <w:rFonts w:ascii="Courier New" w:hAnsi="Courier New" w:eastAsia="Courier New"/>
+          <w:rFonts w:ascii="Times New Roman" w:hAnsi="Times New Roman" w:eastAsia="Courier New"/>
           <w:b w:val="0"/>
           <w:i w:val="0"/>
           <w:sz w:val="20"/>
         </w:rPr>
-        <w:t>cp use_case_diagram.png diagrams/use-case/use_case_diagram.png</w:t>
+        <w:t>cp use_case_diagram_syllabus_uno.png docs/diagrams/use_case_diagram_syllabus_uno.png</w:t>
       </w:r>
     </w:p>
     <w:p>
@@ -1375,7 +1380,7 @@
       </w:pPr>
       <w:r>
         <w:rPr>
-          <w:rFonts w:ascii="Courier New" w:hAnsi="Courier New" w:eastAsia="Courier New"/>
+          <w:rFonts w:ascii="Times New Roman" w:hAnsi="Times New Roman" w:eastAsia="Courier New"/>
           <w:b w:val="0"/>
           <w:i w:val="0"/>
           <w:sz w:val="20"/>
@@ -1391,12 +1396,12 @@
       </w:pPr>
       <w:r>
         <w:rPr>
-          <w:rFonts w:ascii="Courier New" w:hAnsi="Courier New" w:eastAsia="Courier New"/>
+          <w:rFonts w:ascii="Times New Roman" w:hAnsi="Times New Roman" w:eastAsia="Courier New"/>
           <w:b w:val="0"/>
           <w:i w:val="0"/>
           <w:sz w:val="20"/>
         </w:rPr>
-        <w:t>git add diagrams/use-case/use_case_diagram.png</w:t>
+        <w:t>git add docs/diagrams/use_case_diagram_syllabus_uno.png</w:t>
       </w:r>
     </w:p>
     <w:p>
@@ -1407,7 +1412,7 @@
       </w:pPr>
       <w:r>
         <w:rPr>
-          <w:rFonts w:ascii="Courier New" w:hAnsi="Courier New" w:eastAsia="Courier New"/>
+          <w:rFonts w:ascii="Times New Roman" w:hAnsi="Times New Roman" w:eastAsia="Courier New"/>
           <w:b w:val="0"/>
           <w:i w:val="0"/>
           <w:sz w:val="20"/>
@@ -1423,7 +1428,7 @@
       </w:pPr>
       <w:r>
         <w:rPr>
-          <w:rFonts w:ascii="Courier New" w:hAnsi="Courier New" w:eastAsia="Courier New"/>
+          <w:rFonts w:ascii="Times New Roman" w:hAnsi="Times New Roman" w:eastAsia="Courier New"/>
           <w:b w:val="0"/>
           <w:i w:val="0"/>
           <w:sz w:val="20"/>
@@ -1488,7 +1493,7 @@
       </w:pPr>
       <w:r>
         <w:rPr>
-          <w:rFonts w:ascii="Courier New" w:hAnsi="Courier New" w:eastAsia="Courier New"/>
+          <w:rFonts w:ascii="Times New Roman" w:hAnsi="Times New Roman" w:eastAsia="Courier New"/>
           <w:b w:val="0"/>
           <w:i w:val="0"/>
           <w:sz w:val="20"/>
@@ -1504,7 +1509,7 @@
       </w:pPr>
       <w:r>
         <w:rPr>
-          <w:rFonts w:ascii="Courier New" w:hAnsi="Courier New" w:eastAsia="Courier New"/>
+          <w:rFonts w:ascii="Times New Roman" w:hAnsi="Times New Roman" w:eastAsia="Courier New"/>
           <w:b w:val="0"/>
           <w:i w:val="0"/>
           <w:sz w:val="20"/>
@@ -1520,7 +1525,7 @@
       </w:pPr>
       <w:r>
         <w:rPr>
-          <w:rFonts w:ascii="Courier New" w:hAnsi="Courier New" w:eastAsia="Courier New"/>
+          <w:rFonts w:ascii="Times New Roman" w:hAnsi="Times New Roman" w:eastAsia="Courier New"/>
           <w:b w:val="0"/>
           <w:i w:val="0"/>
           <w:sz w:val="20"/>
@@ -1535,7 +1540,7 @@
       </w:pPr>
       <w:r>
         <w:rPr>
-          <w:rFonts w:ascii="Courier New" w:hAnsi="Courier New" w:eastAsia="Courier New"/>
+          <w:rFonts w:ascii="Times New Roman" w:hAnsi="Times New Roman" w:eastAsia="Courier New"/>
           <w:b w:val="0"/>
           <w:i w:val="0"/>
           <w:sz w:val="20"/>
@@ -1551,12 +1556,12 @@
       </w:pPr>
       <w:r>
         <w:rPr>
-          <w:rFonts w:ascii="Courier New" w:hAnsi="Courier New" w:eastAsia="Courier New"/>
+          <w:rFonts w:ascii="Times New Roman" w:hAnsi="Times New Roman" w:eastAsia="Courier New"/>
           <w:b w:val="0"/>
           <w:i w:val="0"/>
           <w:sz w:val="20"/>
         </w:rPr>
-        <w:t>Додано файл diagrams/class/class_diagram.puml з PlantUML-кодом діаграми класів системи Syllabus.uno.</w:t>
+        <w:t>Додано файл docs/uml/class_diagram_syllabus_uno.puml з PlantUML-кодом діаграми класів системи Syllabus.uno.</w:t>
       </w:r>
     </w:p>
     <w:p>
@@ -1567,7 +1572,7 @@
       </w:pPr>
       <w:r>
         <w:rPr>
-          <w:rFonts w:ascii="Courier New" w:hAnsi="Courier New" w:eastAsia="Courier New"/>
+          <w:rFonts w:ascii="Times New Roman" w:hAnsi="Times New Roman" w:eastAsia="Courier New"/>
           <w:b w:val="0"/>
           <w:i w:val="0"/>
           <w:sz w:val="20"/>
@@ -1582,7 +1587,7 @@
       </w:pPr>
       <w:r>
         <w:rPr>
-          <w:rFonts w:ascii="Courier New" w:hAnsi="Courier New" w:eastAsia="Courier New"/>
+          <w:rFonts w:ascii="Times New Roman" w:hAnsi="Times New Roman" w:eastAsia="Courier New"/>
           <w:b w:val="0"/>
           <w:i w:val="0"/>
           <w:sz w:val="20"/>
@@ -1598,7 +1603,7 @@
       </w:pPr>
       <w:r>
         <w:rPr>
-          <w:rFonts w:ascii="Courier New" w:hAnsi="Courier New" w:eastAsia="Courier New"/>
+          <w:rFonts w:ascii="Times New Roman" w:hAnsi="Times New Roman" w:eastAsia="Courier New"/>
           <w:b w:val="0"/>
           <w:i w:val="0"/>
           <w:sz w:val="20"/>
@@ -1614,7 +1619,7 @@
       </w:pPr>
       <w:r>
         <w:rPr>
-          <w:rFonts w:ascii="Courier New" w:hAnsi="Courier New" w:eastAsia="Courier New"/>
+          <w:rFonts w:ascii="Times New Roman" w:hAnsi="Times New Roman" w:eastAsia="Courier New"/>
           <w:b w:val="0"/>
           <w:i w:val="0"/>
           <w:sz w:val="20"/>
@@ -1629,7 +1634,7 @@
       </w:pPr>
       <w:r>
         <w:rPr>
-          <w:rFonts w:ascii="Courier New" w:hAnsi="Courier New" w:eastAsia="Courier New"/>
+          <w:rFonts w:ascii="Times New Roman" w:hAnsi="Times New Roman" w:eastAsia="Courier New"/>
           <w:b w:val="0"/>
           <w:i w:val="0"/>
           <w:sz w:val="20"/>
@@ -1645,7 +1650,7 @@
       </w:pPr>
       <w:r>
         <w:rPr>
-          <w:rFonts w:ascii="Courier New" w:hAnsi="Courier New" w:eastAsia="Courier New"/>
+          <w:rFonts w:ascii="Times New Roman" w:hAnsi="Times New Roman" w:eastAsia="Courier New"/>
           <w:b w:val="0"/>
           <w:i w:val="0"/>
           <w:sz w:val="20"/>
@@ -1661,7 +1666,7 @@
       </w:pPr>
       <w:r>
         <w:rPr>
-          <w:rFonts w:ascii="Courier New" w:hAnsi="Courier New" w:eastAsia="Courier New"/>
+          <w:rFonts w:ascii="Times New Roman" w:hAnsi="Times New Roman" w:eastAsia="Courier New"/>
           <w:b w:val="0"/>
           <w:i w:val="0"/>
           <w:sz w:val="20"/>
@@ -1677,7 +1682,7 @@
       </w:pPr>
       <w:r>
         <w:rPr>
-          <w:rFonts w:ascii="Courier New" w:hAnsi="Courier New" w:eastAsia="Courier New"/>
+          <w:rFonts w:ascii="Times New Roman" w:hAnsi="Times New Roman" w:eastAsia="Courier New"/>
           <w:b w:val="0"/>
           <w:i w:val="0"/>
           <w:sz w:val="20"/>
@@ -1693,7 +1698,7 @@
       </w:pPr>
       <w:r>
         <w:rPr>
-          <w:rFonts w:ascii="Courier New" w:hAnsi="Courier New" w:eastAsia="Courier New"/>
+          <w:rFonts w:ascii="Times New Roman" w:hAnsi="Times New Roman" w:eastAsia="Courier New"/>
           <w:b w:val="0"/>
           <w:i w:val="0"/>
           <w:sz w:val="20"/>
@@ -1726,7 +1731,7 @@
       </w:pPr>
       <w:r>
         <w:rPr>
-          <w:rFonts w:ascii="Courier New" w:hAnsi="Courier New" w:eastAsia="Courier New"/>
+          <w:rFonts w:ascii="Times New Roman" w:hAnsi="Times New Roman" w:eastAsia="Courier New"/>
           <w:b w:val="0"/>
           <w:i w:val="0"/>
           <w:sz w:val="20"/>
@@ -1742,7 +1747,7 @@
       </w:pPr>
       <w:r>
         <w:rPr>
-          <w:rFonts w:ascii="Courier New" w:hAnsi="Courier New" w:eastAsia="Courier New"/>
+          <w:rFonts w:ascii="Times New Roman" w:hAnsi="Times New Roman" w:eastAsia="Courier New"/>
           <w:b w:val="0"/>
           <w:i w:val="0"/>
           <w:sz w:val="20"/>
@@ -1758,7 +1763,7 @@
       </w:pPr>
       <w:r>
         <w:rPr>
-          <w:rFonts w:ascii="Courier New" w:hAnsi="Courier New" w:eastAsia="Courier New"/>
+          <w:rFonts w:ascii="Times New Roman" w:hAnsi="Times New Roman" w:eastAsia="Courier New"/>
           <w:b w:val="0"/>
           <w:i w:val="0"/>
           <w:sz w:val="20"/>
@@ -1773,7 +1778,7 @@
       </w:pPr>
       <w:r>
         <w:rPr>
-          <w:rFonts w:ascii="Courier New" w:hAnsi="Courier New" w:eastAsia="Courier New"/>
+          <w:rFonts w:ascii="Times New Roman" w:hAnsi="Times New Roman" w:eastAsia="Courier New"/>
           <w:b w:val="0"/>
           <w:i w:val="0"/>
           <w:sz w:val="20"/>
@@ -1789,7 +1794,7 @@
       </w:pPr>
       <w:r>
         <w:rPr>
-          <w:rFonts w:ascii="Courier New" w:hAnsi="Courier New" w:eastAsia="Courier New"/>
+          <w:rFonts w:ascii="Times New Roman" w:hAnsi="Times New Roman" w:eastAsia="Courier New"/>
           <w:b w:val="0"/>
           <w:i w:val="0"/>
           <w:sz w:val="20"/>
@@ -1805,7 +1810,7 @@
       </w:pPr>
       <w:r>
         <w:rPr>
-          <w:rFonts w:ascii="Courier New" w:hAnsi="Courier New" w:eastAsia="Courier New"/>
+          <w:rFonts w:ascii="Times New Roman" w:hAnsi="Times New Roman" w:eastAsia="Courier New"/>
           <w:b w:val="0"/>
           <w:i w:val="0"/>
           <w:sz w:val="20"/>
@@ -1820,7 +1825,7 @@
       </w:pPr>
       <w:r>
         <w:rPr>
-          <w:rFonts w:ascii="Courier New" w:hAnsi="Courier New" w:eastAsia="Courier New"/>
+          <w:rFonts w:ascii="Times New Roman" w:hAnsi="Times New Roman" w:eastAsia="Courier New"/>
           <w:b w:val="0"/>
           <w:i w:val="0"/>
           <w:sz w:val="20"/>
@@ -1836,7 +1841,7 @@
       </w:pPr>
       <w:r>
         <w:rPr>
-          <w:rFonts w:ascii="Courier New" w:hAnsi="Courier New" w:eastAsia="Courier New"/>
+          <w:rFonts w:ascii="Times New Roman" w:hAnsi="Times New Roman" w:eastAsia="Courier New"/>
           <w:b w:val="0"/>
           <w:i w:val="0"/>
           <w:sz w:val="20"/>
@@ -1852,7 +1857,7 @@
       </w:pPr>
       <w:r>
         <w:rPr>
-          <w:rFonts w:ascii="Courier New" w:hAnsi="Courier New" w:eastAsia="Courier New"/>
+          <w:rFonts w:ascii="Times New Roman" w:hAnsi="Times New Roman" w:eastAsia="Courier New"/>
           <w:b w:val="0"/>
           <w:i w:val="0"/>
           <w:sz w:val="20"/>
@@ -1867,7 +1872,7 @@
       </w:pPr>
       <w:r>
         <w:rPr>
-          <w:rFonts w:ascii="Courier New" w:hAnsi="Courier New" w:eastAsia="Courier New"/>
+          <w:rFonts w:ascii="Times New Roman" w:hAnsi="Times New Roman" w:eastAsia="Courier New"/>
           <w:b w:val="0"/>
           <w:i w:val="0"/>
           <w:sz w:val="20"/>
@@ -1883,7 +1888,7 @@
       </w:pPr>
       <w:r>
         <w:rPr>
-          <w:rFonts w:ascii="Courier New" w:hAnsi="Courier New" w:eastAsia="Courier New"/>
+          <w:rFonts w:ascii="Times New Roman" w:hAnsi="Times New Roman" w:eastAsia="Courier New"/>
           <w:b w:val="0"/>
           <w:i w:val="0"/>
           <w:sz w:val="20"/>
@@ -1899,7 +1904,7 @@
       </w:pPr>
       <w:r>
         <w:rPr>
-          <w:rFonts w:ascii="Courier New" w:hAnsi="Courier New" w:eastAsia="Courier New"/>
+          <w:rFonts w:ascii="Times New Roman" w:hAnsi="Times New Roman" w:eastAsia="Courier New"/>
           <w:b w:val="0"/>
           <w:i w:val="0"/>
           <w:sz w:val="20"/>
@@ -1915,7 +1920,7 @@
       </w:pPr>
       <w:r>
         <w:rPr>
-          <w:rFonts w:ascii="Courier New" w:hAnsi="Courier New" w:eastAsia="Courier New"/>
+          <w:rFonts w:ascii="Times New Roman" w:hAnsi="Times New Roman" w:eastAsia="Courier New"/>
           <w:b w:val="0"/>
           <w:i w:val="0"/>
           <w:sz w:val="20"/>
@@ -1931,7 +1936,7 @@
       </w:pPr>
       <w:r>
         <w:rPr>
-          <w:rFonts w:ascii="Courier New" w:hAnsi="Courier New" w:eastAsia="Courier New"/>
+          <w:rFonts w:ascii="Times New Roman" w:hAnsi="Times New Roman" w:eastAsia="Courier New"/>
           <w:b w:val="0"/>
           <w:i w:val="0"/>
           <w:sz w:val="20"/>
@@ -1968,7 +1973,7 @@
           <w:i w:val="0"/>
           <w:sz w:val="28"/>
         </w:rPr>
-        <w:t>Для виконання пункту 9 створено файл class_diagram_syllabus_uno.puml. Його потрібно додати до репозиторію у директорію diagrams/class/ під назвою class_diagram.puml.</w:t>
+        <w:t>Для виконання пункту 9 створено файл class_diagram_syllabus_uno.puml. Його потрібно додати до репозиторію у директорію docs/uml/ під назвою class_diagram_syllabus_uno.puml.</w:t>
       </w:r>
     </w:p>
     <w:p>
@@ -1988,458 +1993,406 @@
     </w:p>
     <w:p>
       <w:pPr>
-        <w:spacing w:line="276" w:lineRule="auto" w:after="80"/>
-        <w:ind w:firstLine="709"/>
         <w:jc w:val="both"/>
       </w:pPr>
       <w:r>
         <w:rPr>
-          <w:rFonts w:ascii="Times New Roman" w:hAnsi="Times New Roman" w:eastAsia="Times New Roman"/>
-          <w:b w:val="0"/>
-          <w:i w:val="0"/>
+          <w:rFonts w:ascii="Times New Roman" w:hAnsi="Times New Roman"/>
           <w:sz w:val="28"/>
         </w:rPr>
-        <w:t>Після фактичного виконання дій на GitHub у цей розділ потрібно вставити копії екранів, що підтверджують виконання роботи. Рекомендований перелік скріншотів наведено нижче.</w:t>
+        <w:t>Нижче наведено копії екранів, що підтверджують фактичне виконання лабораторної роботи у GitHub та PowerShell. На скріншотах показано головну сторінку репозиторію, список Pull Requests, історію комітів, призначення reviewers, отримання approves, а також злиття гілок initialize-repository, feature/class-diagram та feature/use-case-diagram у main.</w:t>
       </w:r>
     </w:p>
     <w:p>
       <w:pPr>
-        <w:spacing w:line="276" w:lineRule="auto" w:after="40"/>
-        <w:ind w:left="397" w:hanging="227"/>
-        <w:jc w:val="both"/>
+        <w:jc w:val="center"/>
       </w:pPr>
       <w:r>
         <w:rPr>
-          <w:rFonts w:ascii="Times New Roman" w:hAnsi="Times New Roman" w:eastAsia="Times New Roman"/>
-          <w:b w:val="0"/>
-          <w:i w:val="0"/>
+          <w:rFonts w:ascii="Times New Roman" w:hAnsi="Times New Roman"/>
           <w:sz w:val="28"/>
         </w:rPr>
-        <w:t>– сторінка репозиторію GitHub із гілкою main;</w:t>
+        <w:drawing>
+          <wp:inline xmlns:a="http://schemas.openxmlformats.org/drawingml/2006/main" xmlns:pic="http://schemas.openxmlformats.org/drawingml/2006/picture">
+            <wp:extent cx="5832000" cy="3280500"/>
+            <wp:docPr id="1" name="Picture 1"/>
+            <wp:cNvGraphicFramePr>
+              <a:graphicFrameLocks noChangeAspect="1"/>
+            </wp:cNvGraphicFramePr>
+            <a:graphic>
+              <a:graphicData uri="http://schemas.openxmlformats.org/drawingml/2006/picture">
+                <pic:pic>
+                  <pic:nvPicPr>
+                    <pic:cNvPr id="0" name="01_repo_main.png"/>
+                    <pic:cNvPicPr/>
+                  </pic:nvPicPr>
+                  <pic:blipFill>
+                    <a:blip r:embed="rId9"/>
+                    <a:stretch>
+                      <a:fillRect/>
+                    </a:stretch>
+                  </pic:blipFill>
+                  <pic:spPr>
+                    <a:xfrm>
+                      <a:off x="0" y="0"/>
+                      <a:ext cx="5832000" cy="3280500"/>
+                    </a:xfrm>
+                    <a:prstGeom prst="rect"/>
+                  </pic:spPr>
+                </pic:pic>
+              </a:graphicData>
+            </a:graphic>
+          </wp:inline>
+        </w:drawing>
       </w:r>
     </w:p>
     <w:p>
       <w:pPr>
-        <w:spacing w:line="276" w:lineRule="auto" w:after="40"/>
-        <w:ind w:left="397" w:hanging="227"/>
-        <w:jc w:val="both"/>
+        <w:jc w:val="center"/>
       </w:pPr>
       <w:r>
         <w:rPr>
-          <w:rFonts w:ascii="Times New Roman" w:hAnsi="Times New Roman" w:eastAsia="Times New Roman"/>
-          <w:b w:val="0"/>
-          <w:i w:val="0"/>
-          <w:sz w:val="28"/>
+          <w:rFonts w:ascii="Times New Roman" w:hAnsi="Times New Roman"/>
+          <w:i/>
+          <w:sz w:val="24"/>
         </w:rPr>
-        <w:t>– результат виконання git pull у локальному терміналі;</w:t>
+        <w:t>Рисунок 1.1 – Головна сторінка репозиторію mazurenko-stud/syllabus у гілці main</w:t>
       </w:r>
     </w:p>
     <w:p>
       <w:pPr>
-        <w:spacing w:line="276" w:lineRule="auto" w:after="40"/>
-        <w:ind w:left="397" w:hanging="227"/>
-        <w:jc w:val="both"/>
+        <w:jc w:val="center"/>
       </w:pPr>
       <w:r>
         <w:rPr>
-          <w:rFonts w:ascii="Times New Roman" w:hAnsi="Times New Roman" w:eastAsia="Times New Roman"/>
-          <w:b w:val="0"/>
-          <w:i w:val="0"/>
+          <w:rFonts w:ascii="Times New Roman" w:hAnsi="Times New Roman"/>
           <w:sz w:val="28"/>
         </w:rPr>
-        <w:t>– створена гілка feature/class-diagram на GitHub;</w:t>
+        <w:drawing>
+          <wp:inline xmlns:a="http://schemas.openxmlformats.org/drawingml/2006/main" xmlns:pic="http://schemas.openxmlformats.org/drawingml/2006/picture">
+            <wp:extent cx="5832000" cy="3280500"/>
+            <wp:docPr id="2" name="Picture 2"/>
+            <wp:cNvGraphicFramePr>
+              <a:graphicFrameLocks noChangeAspect="1"/>
+            </wp:cNvGraphicFramePr>
+            <a:graphic>
+              <a:graphicData uri="http://schemas.openxmlformats.org/drawingml/2006/picture">
+                <pic:pic>
+                  <pic:nvPicPr>
+                    <pic:cNvPr id="0" name="02_pr_list_git_log.png"/>
+                    <pic:cNvPicPr/>
+                  </pic:nvPicPr>
+                  <pic:blipFill>
+                    <a:blip r:embed="rId10"/>
+                    <a:stretch>
+                      <a:fillRect/>
+                    </a:stretch>
+                  </pic:blipFill>
+                  <pic:spPr>
+                    <a:xfrm>
+                      <a:off x="0" y="0"/>
+                      <a:ext cx="5832000" cy="3280500"/>
+                    </a:xfrm>
+                    <a:prstGeom prst="rect"/>
+                  </pic:spPr>
+                </pic:pic>
+              </a:graphicData>
+            </a:graphic>
+          </wp:inline>
+        </w:drawing>
       </w:r>
     </w:p>
     <w:p>
       <w:pPr>
-        <w:spacing w:line="276" w:lineRule="auto" w:after="40"/>
-        <w:ind w:left="397" w:hanging="227"/>
-        <w:jc w:val="both"/>
+        <w:jc w:val="center"/>
       </w:pPr>
       <w:r>
         <w:rPr>
-          <w:rFonts w:ascii="Times New Roman" w:hAnsi="Times New Roman" w:eastAsia="Times New Roman"/>
-          <w:b w:val="0"/>
-          <w:i w:val="0"/>
-          <w:sz w:val="28"/>
+          <w:rFonts w:ascii="Times New Roman" w:hAnsi="Times New Roman"/>
+          <w:i/>
+          <w:sz w:val="24"/>
         </w:rPr>
-        <w:t>– файл diagrams/class/class_diagram.puml у віддаленому репозиторії;</w:t>
+        <w:t>Рисунок 1.2 – Перевірка Pull Requests та історії комітів у PowerShell</w:t>
       </w:r>
     </w:p>
     <w:p>
       <w:pPr>
-        <w:spacing w:line="276" w:lineRule="auto" w:after="40"/>
-        <w:ind w:left="397" w:hanging="227"/>
-        <w:jc w:val="both"/>
+        <w:jc w:val="center"/>
       </w:pPr>
       <w:r>
         <w:rPr>
-          <w:rFonts w:ascii="Times New Roman" w:hAnsi="Times New Roman" w:eastAsia="Times New Roman"/>
-          <w:b w:val="0"/>
-          <w:i w:val="0"/>
+          <w:rFonts w:ascii="Times New Roman" w:hAnsi="Times New Roman"/>
           <w:sz w:val="28"/>
         </w:rPr>
-        <w:t>– Pull Request з гілки feature/class-diagram у main;</w:t>
+        <w:drawing>
+          <wp:inline xmlns:a="http://schemas.openxmlformats.org/drawingml/2006/main" xmlns:pic="http://schemas.openxmlformats.org/drawingml/2006/picture">
+            <wp:extent cx="5832000" cy="2527200"/>
+            <wp:docPr id="3" name="Picture 3"/>
+            <wp:cNvGraphicFramePr>
+              <a:graphicFrameLocks noChangeAspect="1"/>
+            </wp:cNvGraphicFramePr>
+            <a:graphic>
+              <a:graphicData uri="http://schemas.openxmlformats.org/drawingml/2006/picture">
+                <pic:pic>
+                  <pic:nvPicPr>
+                    <pic:cNvPr id="0" name="03_pr1_merged_reviewers.png"/>
+                    <pic:cNvPicPr/>
+                  </pic:nvPicPr>
+                  <pic:blipFill>
+                    <a:blip r:embed="rId11"/>
+                    <a:stretch>
+                      <a:fillRect/>
+                    </a:stretch>
+                  </pic:blipFill>
+                  <pic:spPr>
+                    <a:xfrm>
+                      <a:off x="0" y="0"/>
+                      <a:ext cx="5832000" cy="2527200"/>
+                    </a:xfrm>
+                    <a:prstGeom prst="rect"/>
+                  </pic:spPr>
+                </pic:pic>
+              </a:graphicData>
+            </a:graphic>
+          </wp:inline>
+        </w:drawing>
       </w:r>
     </w:p>
     <w:p>
       <w:pPr>
-        <w:spacing w:line="276" w:lineRule="auto" w:after="40"/>
-        <w:ind w:left="397" w:hanging="227"/>
-        <w:jc w:val="both"/>
+        <w:jc w:val="center"/>
       </w:pPr>
       <w:r>
         <w:rPr>
-          <w:rFonts w:ascii="Times New Roman" w:hAnsi="Times New Roman" w:eastAsia="Times New Roman"/>
-          <w:b w:val="0"/>
-          <w:i w:val="0"/>
-          <w:sz w:val="28"/>
+          <w:rFonts w:ascii="Times New Roman" w:hAnsi="Times New Roman"/>
+          <w:i/>
+          <w:sz w:val="24"/>
         </w:rPr>
-        <w:t>– створена гілка feature/use-case-diagram на GitHub;</w:t>
+        <w:t>Рисунок 1.3 – Pull Request initialize-repository із підтвердженнями reviewers</w:t>
       </w:r>
     </w:p>
     <w:p>
       <w:pPr>
-        <w:spacing w:line="276" w:lineRule="auto" w:after="40"/>
-        <w:ind w:left="397" w:hanging="227"/>
-        <w:jc w:val="both"/>
+        <w:jc w:val="center"/>
       </w:pPr>
       <w:r>
         <w:rPr>
-          <w:rFonts w:ascii="Times New Roman" w:hAnsi="Times New Roman" w:eastAsia="Times New Roman"/>
-          <w:b w:val="0"/>
-          <w:i w:val="0"/>
+          <w:rFonts w:ascii="Times New Roman" w:hAnsi="Times New Roman"/>
           <w:sz w:val="28"/>
         </w:rPr>
-        <w:t>– файл із зображенням діаграми варіантів використання у директорії diagrams/use-case;</w:t>
+        <w:drawing>
+          <wp:inline xmlns:a="http://schemas.openxmlformats.org/drawingml/2006/main" xmlns:pic="http://schemas.openxmlformats.org/drawingml/2006/picture">
+            <wp:extent cx="5832000" cy="3280500"/>
+            <wp:docPr id="4" name="Picture 4"/>
+            <wp:cNvGraphicFramePr>
+              <a:graphicFrameLocks noChangeAspect="1"/>
+            </wp:cNvGraphicFramePr>
+            <a:graphic>
+              <a:graphicData uri="http://schemas.openxmlformats.org/drawingml/2006/picture">
+                <pic:pic>
+                  <pic:nvPicPr>
+                    <pic:cNvPr id="0" name="04_pr2_review_requested.png"/>
+                    <pic:cNvPicPr/>
+                  </pic:nvPicPr>
+                  <pic:blipFill>
+                    <a:blip r:embed="rId12"/>
+                    <a:stretch>
+                      <a:fillRect/>
+                    </a:stretch>
+                  </pic:blipFill>
+                  <pic:spPr>
+                    <a:xfrm>
+                      <a:off x="0" y="0"/>
+                      <a:ext cx="5832000" cy="3280500"/>
+                    </a:xfrm>
+                    <a:prstGeom prst="rect"/>
+                  </pic:spPr>
+                </pic:pic>
+              </a:graphicData>
+            </a:graphic>
+          </wp:inline>
+        </w:drawing>
       </w:r>
     </w:p>
     <w:p>
       <w:pPr>
-        <w:spacing w:line="276" w:lineRule="auto" w:after="40"/>
-        <w:ind w:left="397" w:hanging="227"/>
-        <w:jc w:val="both"/>
+        <w:jc w:val="center"/>
       </w:pPr>
       <w:r>
         <w:rPr>
-          <w:rFonts w:ascii="Times New Roman" w:hAnsi="Times New Roman" w:eastAsia="Times New Roman"/>
-          <w:b w:val="0"/>
-          <w:i w:val="0"/>
-          <w:sz w:val="28"/>
+          <w:rFonts w:ascii="Times New Roman" w:hAnsi="Times New Roman"/>
+          <w:i/>
+          <w:sz w:val="24"/>
         </w:rPr>
-        <w:t>– Pull Request з гілки feature/use-case-diagram у main;</w:t>
+        <w:t>Рисунок 1.4 – Pull Request feature/class-diagram із призначеними reviewers</w:t>
       </w:r>
     </w:p>
     <w:p>
       <w:pPr>
-        <w:spacing w:line="276" w:lineRule="auto" w:after="40"/>
-        <w:ind w:left="397" w:hanging="227"/>
-        <w:jc w:val="both"/>
+        <w:jc w:val="center"/>
       </w:pPr>
       <w:r>
         <w:rPr>
-          <w:rFonts w:ascii="Times New Roman" w:hAnsi="Times New Roman" w:eastAsia="Times New Roman"/>
-          <w:b w:val="0"/>
-          <w:i w:val="0"/>
+          <w:rFonts w:ascii="Times New Roman" w:hAnsi="Times New Roman"/>
           <w:sz w:val="28"/>
         </w:rPr>
-        <w:t>– додані reviewers та отримані approves;</w:t>
+        <w:drawing>
+          <wp:inline xmlns:a="http://schemas.openxmlformats.org/drawingml/2006/main" xmlns:pic="http://schemas.openxmlformats.org/drawingml/2006/picture">
+            <wp:extent cx="5832000" cy="2527200"/>
+            <wp:docPr id="5" name="Picture 5"/>
+            <wp:cNvGraphicFramePr>
+              <a:graphicFrameLocks noChangeAspect="1"/>
+            </wp:cNvGraphicFramePr>
+            <a:graphic>
+              <a:graphicData uri="http://schemas.openxmlformats.org/drawingml/2006/picture">
+                <pic:pic>
+                  <pic:nvPicPr>
+                    <pic:cNvPr id="0" name="05_pr2_approvals.png"/>
+                    <pic:cNvPicPr/>
+                  </pic:nvPicPr>
+                  <pic:blipFill>
+                    <a:blip r:embed="rId13"/>
+                    <a:stretch>
+                      <a:fillRect/>
+                    </a:stretch>
+                  </pic:blipFill>
+                  <pic:spPr>
+                    <a:xfrm>
+                      <a:off x="0" y="0"/>
+                      <a:ext cx="5832000" cy="2527200"/>
+                    </a:xfrm>
+                    <a:prstGeom prst="rect"/>
+                  </pic:spPr>
+                </pic:pic>
+              </a:graphicData>
+            </a:graphic>
+          </wp:inline>
+        </w:drawing>
       </w:r>
     </w:p>
     <w:p>
       <w:pPr>
-        <w:spacing w:line="276" w:lineRule="auto" w:after="40"/>
-        <w:ind w:left="397" w:hanging="227"/>
-        <w:jc w:val="both"/>
+        <w:jc w:val="center"/>
       </w:pPr>
       <w:r>
         <w:rPr>
-          <w:rFonts w:ascii="Times New Roman" w:hAnsi="Times New Roman" w:eastAsia="Times New Roman"/>
-          <w:b w:val="0"/>
-          <w:i w:val="0"/>
+          <w:rFonts w:ascii="Times New Roman" w:hAnsi="Times New Roman"/>
+          <w:i/>
+          <w:sz w:val="24"/>
+        </w:rPr>
+        <w:t>Рисунок 1.5 – Отримання двох approvals перед злиттям Pull Request</w:t>
+      </w:r>
+    </w:p>
+    <w:p>
+      <w:pPr>
+        <w:jc w:val="center"/>
+      </w:pPr>
+      <w:r>
+        <w:rPr>
+          <w:rFonts w:ascii="Times New Roman" w:hAnsi="Times New Roman"/>
           <w:sz w:val="28"/>
         </w:rPr>
-        <w:t>– злиті Pull Requests у гілку main.</w:t>
+        <w:drawing>
+          <wp:inline xmlns:a="http://schemas.openxmlformats.org/drawingml/2006/main" xmlns:pic="http://schemas.openxmlformats.org/drawingml/2006/picture">
+            <wp:extent cx="5832000" cy="3280500"/>
+            <wp:docPr id="6" name="Picture 6"/>
+            <wp:cNvGraphicFramePr>
+              <a:graphicFrameLocks noChangeAspect="1"/>
+            </wp:cNvGraphicFramePr>
+            <a:graphic>
+              <a:graphicData uri="http://schemas.openxmlformats.org/drawingml/2006/picture">
+                <pic:pic>
+                  <pic:nvPicPr>
+                    <pic:cNvPr id="0" name="06_pr2_merged_file.png"/>
+                    <pic:cNvPicPr/>
+                  </pic:nvPicPr>
+                  <pic:blipFill>
+                    <a:blip r:embed="rId14"/>
+                    <a:stretch>
+                      <a:fillRect/>
+                    </a:stretch>
+                  </pic:blipFill>
+                  <pic:spPr>
+                    <a:xfrm>
+                      <a:off x="0" y="0"/>
+                      <a:ext cx="5832000" cy="3280500"/>
+                    </a:xfrm>
+                    <a:prstGeom prst="rect"/>
+                  </pic:spPr>
+                </pic:pic>
+              </a:graphicData>
+            </a:graphic>
+          </wp:inline>
+        </w:drawing>
       </w:r>
     </w:p>
-    <w:tbl>
-      <w:tblPr>
-        <w:tblW w:type="auto" w:w="0"/>
-        <w:jc w:val="center"/>
-        <w:tblLook w:firstColumn="1" w:firstRow="1" w:lastColumn="0" w:lastRow="0" w:noHBand="0" w:noVBand="1" w:val="04A0"/>
-        <w:tblBorders>
-          <w:top w:val="single" w:sz="4" w:space="0" w:color="000000"/>
-          <w:left w:val="single" w:sz="4" w:space="0" w:color="000000"/>
-          <w:bottom w:val="single" w:sz="4" w:space="0" w:color="000000"/>
-          <w:right w:val="single" w:sz="4" w:space="0" w:color="000000"/>
-          <w:insideH w:val="single" w:sz="4" w:space="0" w:color="000000"/>
-          <w:insideV w:val="single" w:sz="4" w:space="0" w:color="000000"/>
-        </w:tblBorders>
-      </w:tblPr>
-      <w:tblGrid>
-        <w:gridCol w:w="9639"/>
-      </w:tblGrid>
-      <w:tr>
-        <w:tc>
-          <w:tcPr>
-            <w:tcW w:type="dxa" w:w="9639"/>
-            <w:vAlign w:val="top"/>
-          </w:tcPr>
-          <w:p>
-            <w:pPr>
-              <w:spacing w:line="240" w:lineRule="auto"/>
-              <w:jc w:val="left"/>
-            </w:pPr>
-            <w:r/>
-            <w:r>
-              <w:rPr>
-                <w:rFonts w:ascii="Times New Roman" w:hAnsi="Times New Roman" w:eastAsia="Times New Roman"/>
-                <w:b w:val="0"/>
-                <w:i w:val="0"/>
-                <w:sz w:val="24"/>
-              </w:rPr>
-              <w:t>Місце для вставлення скріншоту</w:t>
-            </w:r>
-          </w:p>
-        </w:tc>
-      </w:tr>
-    </w:tbl>
     <w:p>
       <w:pPr>
         <w:jc w:val="center"/>
       </w:pPr>
       <w:r>
         <w:rPr>
-          <w:rFonts w:ascii="Times New Roman" w:hAnsi="Times New Roman" w:eastAsia="Times New Roman"/>
-          <w:b w:val="0"/>
-          <w:i w:val="0"/>
+          <w:rFonts w:ascii="Times New Roman" w:hAnsi="Times New Roman"/>
+          <w:i/>
           <w:sz w:val="24"/>
         </w:rPr>
-        <w:t>Рисунок 1.1 – Оновлення локальної гілки main командою git pull</w:t>
+        <w:t>Рисунок 1.6 – Злитий Pull Request із PlantUML-кодом діаграми класів</w:t>
       </w:r>
     </w:p>
-    <w:tbl>
-      <w:tblPr>
-        <w:tblW w:type="auto" w:w="0"/>
-        <w:jc w:val="center"/>
-        <w:tblLook w:firstColumn="1" w:firstRow="1" w:lastColumn="0" w:lastRow="0" w:noHBand="0" w:noVBand="1" w:val="04A0"/>
-        <w:tblBorders>
-          <w:top w:val="single" w:sz="4" w:space="0" w:color="000000"/>
-          <w:left w:val="single" w:sz="4" w:space="0" w:color="000000"/>
-          <w:bottom w:val="single" w:sz="4" w:space="0" w:color="000000"/>
-          <w:right w:val="single" w:sz="4" w:space="0" w:color="000000"/>
-          <w:insideH w:val="single" w:sz="4" w:space="0" w:color="000000"/>
-          <w:insideV w:val="single" w:sz="4" w:space="0" w:color="000000"/>
-        </w:tblBorders>
-      </w:tblPr>
-      <w:tblGrid>
-        <w:gridCol w:w="9639"/>
-      </w:tblGrid>
-      <w:tr>
-        <w:tc>
-          <w:tcPr>
-            <w:tcW w:type="dxa" w:w="9639"/>
-            <w:vAlign w:val="top"/>
-          </w:tcPr>
-          <w:p>
-            <w:pPr>
-              <w:spacing w:line="240" w:lineRule="auto"/>
-              <w:jc w:val="left"/>
-            </w:pPr>
-            <w:r/>
-            <w:r>
-              <w:rPr>
-                <w:rFonts w:ascii="Times New Roman" w:hAnsi="Times New Roman" w:eastAsia="Times New Roman"/>
-                <w:b w:val="0"/>
-                <w:i w:val="0"/>
-                <w:sz w:val="24"/>
-              </w:rPr>
-              <w:t>Місце для вставлення скріншоту</w:t>
-            </w:r>
-          </w:p>
-        </w:tc>
-      </w:tr>
-    </w:tbl>
     <w:p>
       <w:pPr>
         <w:jc w:val="center"/>
       </w:pPr>
       <w:r>
         <w:rPr>
-          <w:rFonts w:ascii="Times New Roman" w:hAnsi="Times New Roman" w:eastAsia="Times New Roman"/>
-          <w:b w:val="0"/>
-          <w:i w:val="0"/>
+          <w:rFonts w:ascii="Times New Roman" w:hAnsi="Times New Roman"/>
+          <w:sz w:val="28"/>
+        </w:rPr>
+        <w:drawing>
+          <wp:inline xmlns:a="http://schemas.openxmlformats.org/drawingml/2006/main" xmlns:pic="http://schemas.openxmlformats.org/drawingml/2006/picture">
+            <wp:extent cx="5832000" cy="3280500"/>
+            <wp:docPr id="7" name="Picture 7"/>
+            <wp:cNvGraphicFramePr>
+              <a:graphicFrameLocks noChangeAspect="1"/>
+            </wp:cNvGraphicFramePr>
+            <a:graphic>
+              <a:graphicData uri="http://schemas.openxmlformats.org/drawingml/2006/picture">
+                <pic:pic>
+                  <pic:nvPicPr>
+                    <pic:cNvPr id="0" name="07_pr3_merged_file.png"/>
+                    <pic:cNvPicPr/>
+                  </pic:nvPicPr>
+                  <pic:blipFill>
+                    <a:blip r:embed="rId15"/>
+                    <a:stretch>
+                      <a:fillRect/>
+                    </a:stretch>
+                  </pic:blipFill>
+                  <pic:spPr>
+                    <a:xfrm>
+                      <a:off x="0" y="0"/>
+                      <a:ext cx="5832000" cy="3280500"/>
+                    </a:xfrm>
+                    <a:prstGeom prst="rect"/>
+                  </pic:spPr>
+                </pic:pic>
+              </a:graphicData>
+            </a:graphic>
+          </wp:inline>
+        </w:drawing>
+      </w:r>
+    </w:p>
+    <w:p>
+      <w:pPr>
+        <w:jc w:val="center"/>
+      </w:pPr>
+      <w:r>
+        <w:rPr>
+          <w:rFonts w:ascii="Times New Roman" w:hAnsi="Times New Roman"/>
+          <w:i/>
           <w:sz w:val="24"/>
         </w:rPr>
-        <w:t>Рисунок 1.2 – Гілка feature/class-diagram і файл class_diagram.puml</w:t>
-      </w:r>
-    </w:p>
-    <w:tbl>
-      <w:tblPr>
-        <w:tblW w:type="auto" w:w="0"/>
-        <w:jc w:val="center"/>
-        <w:tblLook w:firstColumn="1" w:firstRow="1" w:lastColumn="0" w:lastRow="0" w:noHBand="0" w:noVBand="1" w:val="04A0"/>
-        <w:tblBorders>
-          <w:top w:val="single" w:sz="4" w:space="0" w:color="000000"/>
-          <w:left w:val="single" w:sz="4" w:space="0" w:color="000000"/>
-          <w:bottom w:val="single" w:sz="4" w:space="0" w:color="000000"/>
-          <w:right w:val="single" w:sz="4" w:space="0" w:color="000000"/>
-          <w:insideH w:val="single" w:sz="4" w:space="0" w:color="000000"/>
-          <w:insideV w:val="single" w:sz="4" w:space="0" w:color="000000"/>
-        </w:tblBorders>
-      </w:tblPr>
-      <w:tblGrid>
-        <w:gridCol w:w="9639"/>
-      </w:tblGrid>
-      <w:tr>
-        <w:tc>
-          <w:tcPr>
-            <w:tcW w:type="dxa" w:w="9639"/>
-            <w:vAlign w:val="top"/>
-          </w:tcPr>
-          <w:p>
-            <w:pPr>
-              <w:spacing w:line="240" w:lineRule="auto"/>
-              <w:jc w:val="left"/>
-            </w:pPr>
-            <w:r/>
-            <w:r>
-              <w:rPr>
-                <w:rFonts w:ascii="Times New Roman" w:hAnsi="Times New Roman" w:eastAsia="Times New Roman"/>
-                <w:b w:val="0"/>
-                <w:i w:val="0"/>
-                <w:sz w:val="24"/>
-              </w:rPr>
-              <w:t>Місце для вставлення скріншоту</w:t>
-            </w:r>
-          </w:p>
-        </w:tc>
-      </w:tr>
-    </w:tbl>
-    <w:p>
-      <w:pPr>
-        <w:jc w:val="center"/>
-      </w:pPr>
-      <w:r>
-        <w:rPr>
-          <w:rFonts w:ascii="Times New Roman" w:hAnsi="Times New Roman" w:eastAsia="Times New Roman"/>
-          <w:b w:val="0"/>
-          <w:i w:val="0"/>
-          <w:sz w:val="24"/>
-        </w:rPr>
-        <w:t>Рисунок 1.3 – Pull Request для feature/class-diagram</w:t>
-      </w:r>
-    </w:p>
-    <w:tbl>
-      <w:tblPr>
-        <w:tblW w:type="auto" w:w="0"/>
-        <w:jc w:val="center"/>
-        <w:tblLook w:firstColumn="1" w:firstRow="1" w:lastColumn="0" w:lastRow="0" w:noHBand="0" w:noVBand="1" w:val="04A0"/>
-        <w:tblBorders>
-          <w:top w:val="single" w:sz="4" w:space="0" w:color="000000"/>
-          <w:left w:val="single" w:sz="4" w:space="0" w:color="000000"/>
-          <w:bottom w:val="single" w:sz="4" w:space="0" w:color="000000"/>
-          <w:right w:val="single" w:sz="4" w:space="0" w:color="000000"/>
-          <w:insideH w:val="single" w:sz="4" w:space="0" w:color="000000"/>
-          <w:insideV w:val="single" w:sz="4" w:space="0" w:color="000000"/>
-        </w:tblBorders>
-      </w:tblPr>
-      <w:tblGrid>
-        <w:gridCol w:w="9639"/>
-      </w:tblGrid>
-      <w:tr>
-        <w:tc>
-          <w:tcPr>
-            <w:tcW w:type="dxa" w:w="9639"/>
-            <w:vAlign w:val="top"/>
-          </w:tcPr>
-          <w:p>
-            <w:pPr>
-              <w:spacing w:line="240" w:lineRule="auto"/>
-              <w:jc w:val="left"/>
-            </w:pPr>
-            <w:r/>
-            <w:r>
-              <w:rPr>
-                <w:rFonts w:ascii="Times New Roman" w:hAnsi="Times New Roman" w:eastAsia="Times New Roman"/>
-                <w:b w:val="0"/>
-                <w:i w:val="0"/>
-                <w:sz w:val="24"/>
-              </w:rPr>
-              <w:t>Місце для вставлення скріншоту</w:t>
-            </w:r>
-          </w:p>
-        </w:tc>
-      </w:tr>
-    </w:tbl>
-    <w:p>
-      <w:pPr>
-        <w:jc w:val="center"/>
-      </w:pPr>
-      <w:r>
-        <w:rPr>
-          <w:rFonts w:ascii="Times New Roman" w:hAnsi="Times New Roman" w:eastAsia="Times New Roman"/>
-          <w:b w:val="0"/>
-          <w:i w:val="0"/>
-          <w:sz w:val="24"/>
-        </w:rPr>
-        <w:t>Рисунок 1.4 – Гілка feature/use-case-diagram і зображення діаграми</w:t>
-      </w:r>
-    </w:p>
-    <w:tbl>
-      <w:tblPr>
-        <w:tblW w:type="auto" w:w="0"/>
-        <w:jc w:val="center"/>
-        <w:tblLook w:firstColumn="1" w:firstRow="1" w:lastColumn="0" w:lastRow="0" w:noHBand="0" w:noVBand="1" w:val="04A0"/>
-        <w:tblBorders>
-          <w:top w:val="single" w:sz="4" w:space="0" w:color="000000"/>
-          <w:left w:val="single" w:sz="4" w:space="0" w:color="000000"/>
-          <w:bottom w:val="single" w:sz="4" w:space="0" w:color="000000"/>
-          <w:right w:val="single" w:sz="4" w:space="0" w:color="000000"/>
-          <w:insideH w:val="single" w:sz="4" w:space="0" w:color="000000"/>
-          <w:insideV w:val="single" w:sz="4" w:space="0" w:color="000000"/>
-        </w:tblBorders>
-      </w:tblPr>
-      <w:tblGrid>
-        <w:gridCol w:w="9639"/>
-      </w:tblGrid>
-      <w:tr>
-        <w:tc>
-          <w:tcPr>
-            <w:tcW w:type="dxa" w:w="9639"/>
-            <w:vAlign w:val="top"/>
-          </w:tcPr>
-          <w:p>
-            <w:pPr>
-              <w:spacing w:line="240" w:lineRule="auto"/>
-              <w:jc w:val="left"/>
-            </w:pPr>
-            <w:r/>
-            <w:r>
-              <w:rPr>
-                <w:rFonts w:ascii="Times New Roman" w:hAnsi="Times New Roman" w:eastAsia="Times New Roman"/>
-                <w:b w:val="0"/>
-                <w:i w:val="0"/>
-                <w:sz w:val="24"/>
-              </w:rPr>
-              <w:t>Місце для вставлення скріншоту</w:t>
-            </w:r>
-          </w:p>
-        </w:tc>
-      </w:tr>
-    </w:tbl>
-    <w:p>
-      <w:pPr>
-        <w:jc w:val="center"/>
-      </w:pPr>
-      <w:r>
-        <w:rPr>
-          <w:rFonts w:ascii="Times New Roman" w:hAnsi="Times New Roman" w:eastAsia="Times New Roman"/>
-          <w:b w:val="0"/>
-          <w:i w:val="0"/>
-          <w:sz w:val="24"/>
-        </w:rPr>
-        <w:t>Рисунок 1.5 – Pull Request із reviewers та approves</w:t>
+        <w:t>Рисунок 1.7 – Злитий Pull Request із зображенням діаграми варіантів використання</w:t>
       </w:r>
     </w:p>
     <w:p>
@@ -2465,12 +2418,10 @@
       </w:pPr>
       <w:r>
         <w:rPr>
-          <w:rFonts w:ascii="Times New Roman" w:hAnsi="Times New Roman" w:eastAsia="Times New Roman"/>
-          <w:b w:val="0"/>
-          <w:i w:val="0"/>
+          <w:rFonts w:ascii="Times New Roman" w:hAnsi="Times New Roman"/>
           <w:sz w:val="28"/>
         </w:rPr>
-        <w:t>У ході виконання лабораторної роботи було закріплено практичні навички роботи з Git та GitHub. Було розглянуто послідовність оновлення гілки main, створення окремих feature-гілок, додавання файлів до індексу, створення комітів, відправлення змін у віддалений репозиторій та оформлення Pull Requests.</w:t>
+        <w:t>У ході виконання лабораторної роботи було закріплено практичні навички роботи з Git та GitHub. Було створено та опрацьовано гілки initialize-repository, feature/class-diagram і feature/use-case-diagram, виконано коміти зі змістовними повідомленнями, відправлено зміни у віддалений репозиторій та створено Pull Requests у гілку main.</w:t>
       </w:r>
     </w:p>
     <w:p>
@@ -2481,12 +2432,10 @@
       </w:pPr>
       <w:r>
         <w:rPr>
-          <w:rFonts w:ascii="Times New Roman" w:hAnsi="Times New Roman" w:eastAsia="Times New Roman"/>
-          <w:b w:val="0"/>
-          <w:i w:val="0"/>
+          <w:rFonts w:ascii="Times New Roman" w:hAnsi="Times New Roman"/>
           <w:sz w:val="28"/>
         </w:rPr>
-        <w:t>Окремо відпрацьовано організацію командної перевірки змін через reviewers та approves. Використання окремих гілок feature/class-diagram і feature/use-case-diagram дозволяє ізолювати зміни, пов’язані з різними UML-артефактами, і забезпечує контрольоване злиття результатів роботи у main.</w:t>
+        <w:t>Окремо відпрацьовано організацію командної перевірки змін через reviewers та approves. Для кожного Pull Request було призначено reviewers, отримано підтвердження перевірки, після чого Pull Requests були злиті у main. Фінальна версія репозиторію містить README.md, .gitignore, шаблон Pull Request, звіт, PlantUML-код діаграми класів і зображення діаграми варіантів використання.</w:t>
       </w:r>
     </w:p>
     <w:p>

</xml_diff>